<commit_message>
CS 1101 Unit 4 assignment: clean page breaks, keep code blocks together
</commit_message>
<xml_diff>
--- a/Term_02/CS 1101-01 Programming Fundamentals - AY2027-T1/Assignments/Unit 4 Assignment - Rafi.docx
+++ b/Term_02/CS 1101-01 Programming Fundamentals - AY2027-T1/Assignments/Unit 4 Assignment - Rafi.docx
@@ -93,12 +93,8 @@
       </w:r>
     </w:p>
     <w:p>
-      <w:r>
-        <w:br w:type="page"/>
-      </w:r>
-    </w:p>
-    <w:p>
       <w:pPr>
+        <w:pageBreakBefore/>
         <w:spacing w:line="480" w:lineRule="auto"/>
         <w:jc w:val="center"/>
       </w:pPr>
@@ -182,6 +178,7 @@
     </w:p>
     <w:p>
       <w:pPr>
+        <w:keepNext/>
         <w:spacing w:line="480" w:lineRule="auto"/>
       </w:pPr>
       <w:r>
@@ -260,6 +257,7 @@
     </w:p>
     <w:p>
       <w:pPr>
+        <w:keepNext/>
         <w:spacing w:line="240" w:lineRule="auto"/>
       </w:pPr>
       <w:r>
@@ -274,6 +272,7 @@
     </w:p>
     <w:p>
       <w:pPr>
+        <w:keepNext/>
         <w:spacing w:line="240" w:lineRule="auto"/>
       </w:pPr>
       <w:r>
@@ -288,6 +287,7 @@
     </w:p>
     <w:p>
       <w:pPr>
+        <w:keepNext/>
         <w:spacing w:line="240" w:lineRule="auto"/>
       </w:pPr>
       <w:r>
@@ -302,6 +302,7 @@
     </w:p>
     <w:p>
       <w:pPr>
+        <w:keepNext/>
         <w:spacing w:line="240" w:lineRule="auto"/>
       </w:pPr>
       <w:r>
@@ -316,6 +317,7 @@
     </w:p>
     <w:p>
       <w:pPr>
+        <w:keepNext/>
         <w:spacing w:line="240" w:lineRule="auto"/>
       </w:pPr>
       <w:r>
@@ -330,6 +332,7 @@
     </w:p>
     <w:p>
       <w:pPr>
+        <w:keepNext/>
         <w:spacing w:line="240" w:lineRule="auto"/>
       </w:pPr>
       <w:r>
@@ -344,6 +347,7 @@
     </w:p>
     <w:p>
       <w:pPr>
+        <w:keepNext/>
         <w:spacing w:line="240" w:lineRule="auto"/>
       </w:pPr>
       <w:r>
@@ -358,6 +362,7 @@
     </w:p>
     <w:p>
       <w:pPr>
+        <w:keepNext/>
         <w:spacing w:line="240" w:lineRule="auto"/>
       </w:pPr>
       <w:r>
@@ -372,6 +377,7 @@
     </w:p>
     <w:p>
       <w:pPr>
+        <w:keepNext/>
         <w:spacing w:line="240" w:lineRule="auto"/>
       </w:pPr>
       <w:r>
@@ -386,6 +392,7 @@
     </w:p>
     <w:p>
       <w:pPr>
+        <w:keepNext/>
         <w:spacing w:line="240" w:lineRule="auto"/>
       </w:pPr>
       <w:r>
@@ -400,6 +407,7 @@
     </w:p>
     <w:p>
       <w:pPr>
+        <w:keepNext/>
         <w:spacing w:line="240" w:lineRule="auto"/>
       </w:pPr>
       <w:r>
@@ -414,6 +422,7 @@
     </w:p>
     <w:p>
       <w:pPr>
+        <w:keepNext/>
         <w:spacing w:line="240" w:lineRule="auto"/>
       </w:pPr>
       <w:r>
@@ -428,6 +437,7 @@
     </w:p>
     <w:p>
       <w:pPr>
+        <w:keepNext/>
         <w:spacing w:line="240" w:lineRule="auto"/>
       </w:pPr>
       <w:r>
@@ -442,6 +452,7 @@
     </w:p>
     <w:p>
       <w:pPr>
+        <w:keepNext/>
         <w:spacing w:line="240" w:lineRule="auto"/>
       </w:pPr>
       <w:r>
@@ -456,6 +467,7 @@
     </w:p>
     <w:p>
       <w:pPr>
+        <w:keepNext/>
         <w:spacing w:line="240" w:lineRule="auto"/>
       </w:pPr>
       <w:r>
@@ -470,6 +482,7 @@
     </w:p>
     <w:p>
       <w:pPr>
+        <w:keepNext/>
         <w:spacing w:line="240" w:lineRule="auto"/>
       </w:pPr>
       <w:r>
@@ -484,6 +497,7 @@
     </w:p>
     <w:p>
       <w:pPr>
+        <w:keepNext/>
         <w:spacing w:line="240" w:lineRule="auto"/>
       </w:pPr>
       <w:r>
@@ -498,6 +512,7 @@
     </w:p>
     <w:p>
       <w:pPr>
+        <w:keepNext w:val="0"/>
         <w:spacing w:line="240" w:lineRule="auto"/>
       </w:pPr>
       <w:r>
@@ -526,6 +541,7 @@
     </w:p>
     <w:p>
       <w:pPr>
+        <w:keepNext/>
         <w:spacing w:line="240" w:lineRule="auto"/>
       </w:pPr>
       <w:r>
@@ -540,6 +556,7 @@
     </w:p>
     <w:p>
       <w:pPr>
+        <w:keepNext/>
         <w:spacing w:line="240" w:lineRule="auto"/>
       </w:pPr>
       <w:r>
@@ -554,6 +571,7 @@
     </w:p>
     <w:p>
       <w:pPr>
+        <w:keepNext/>
         <w:spacing w:line="240" w:lineRule="auto"/>
       </w:pPr>
       <w:r>
@@ -568,6 +586,7 @@
     </w:p>
     <w:p>
       <w:pPr>
+        <w:keepNext w:val="0"/>
         <w:spacing w:line="240" w:lineRule="auto"/>
       </w:pPr>
       <w:r>
@@ -804,6 +823,7 @@
     </w:p>
     <w:p>
       <w:pPr>
+        <w:keepNext/>
         <w:spacing w:line="480" w:lineRule="auto"/>
       </w:pPr>
       <w:r>
@@ -850,6 +870,7 @@
     </w:p>
     <w:p>
       <w:pPr>
+        <w:keepNext/>
         <w:spacing w:line="240" w:lineRule="auto"/>
       </w:pPr>
       <w:r>
@@ -864,6 +885,7 @@
     </w:p>
     <w:p>
       <w:pPr>
+        <w:keepNext/>
         <w:spacing w:line="240" w:lineRule="auto"/>
       </w:pPr>
       <w:r>
@@ -878,6 +900,7 @@
     </w:p>
     <w:p>
       <w:pPr>
+        <w:keepNext/>
         <w:spacing w:line="240" w:lineRule="auto"/>
       </w:pPr>
       <w:r>
@@ -892,6 +915,7 @@
     </w:p>
     <w:p>
       <w:pPr>
+        <w:keepNext/>
         <w:spacing w:line="240" w:lineRule="auto"/>
       </w:pPr>
       <w:r>
@@ -906,6 +930,7 @@
     </w:p>
     <w:p>
       <w:pPr>
+        <w:keepNext/>
         <w:spacing w:line="240" w:lineRule="auto"/>
       </w:pPr>
       <w:r>
@@ -920,6 +945,7 @@
     </w:p>
     <w:p>
       <w:pPr>
+        <w:keepNext/>
         <w:spacing w:line="240" w:lineRule="auto"/>
       </w:pPr>
       <w:r>
@@ -934,6 +960,7 @@
     </w:p>
     <w:p>
       <w:pPr>
+        <w:keepNext/>
         <w:spacing w:line="240" w:lineRule="auto"/>
       </w:pPr>
       <w:r>
@@ -948,6 +975,7 @@
     </w:p>
     <w:p>
       <w:pPr>
+        <w:keepNext/>
         <w:spacing w:line="240" w:lineRule="auto"/>
       </w:pPr>
       <w:r>
@@ -962,6 +990,7 @@
     </w:p>
     <w:p>
       <w:pPr>
+        <w:keepNext/>
         <w:spacing w:line="240" w:lineRule="auto"/>
       </w:pPr>
       <w:r>
@@ -976,6 +1005,7 @@
     </w:p>
     <w:p>
       <w:pPr>
+        <w:keepNext/>
         <w:spacing w:line="240" w:lineRule="auto"/>
       </w:pPr>
       <w:r>
@@ -990,6 +1020,7 @@
     </w:p>
     <w:p>
       <w:pPr>
+        <w:keepNext/>
         <w:spacing w:line="240" w:lineRule="auto"/>
       </w:pPr>
       <w:r>
@@ -1004,6 +1035,7 @@
     </w:p>
     <w:p>
       <w:pPr>
+        <w:keepNext/>
         <w:spacing w:line="240" w:lineRule="auto"/>
       </w:pPr>
       <w:r>
@@ -1018,6 +1050,7 @@
     </w:p>
     <w:p>
       <w:pPr>
+        <w:keepNext/>
         <w:spacing w:line="240" w:lineRule="auto"/>
       </w:pPr>
       <w:r>
@@ -1032,6 +1065,7 @@
     </w:p>
     <w:p>
       <w:pPr>
+        <w:keepNext/>
         <w:spacing w:line="240" w:lineRule="auto"/>
       </w:pPr>
       <w:r>
@@ -1046,6 +1080,7 @@
     </w:p>
     <w:p>
       <w:pPr>
+        <w:keepNext/>
         <w:spacing w:line="240" w:lineRule="auto"/>
       </w:pPr>
       <w:r>
@@ -1060,6 +1095,7 @@
     </w:p>
     <w:p>
       <w:pPr>
+        <w:keepNext/>
         <w:spacing w:line="240" w:lineRule="auto"/>
       </w:pPr>
       <w:r>
@@ -1074,6 +1110,7 @@
     </w:p>
     <w:p>
       <w:pPr>
+        <w:keepNext/>
         <w:spacing w:line="240" w:lineRule="auto"/>
       </w:pPr>
       <w:r>
@@ -1088,6 +1125,7 @@
     </w:p>
     <w:p>
       <w:pPr>
+        <w:keepNext w:val="0"/>
         <w:spacing w:line="240" w:lineRule="auto"/>
       </w:pPr>
       <w:r>
@@ -1116,6 +1154,7 @@
     </w:p>
     <w:p>
       <w:pPr>
+        <w:keepNext/>
         <w:spacing w:line="240" w:lineRule="auto"/>
       </w:pPr>
       <w:r>
@@ -1130,6 +1169,7 @@
     </w:p>
     <w:p>
       <w:pPr>
+        <w:keepNext/>
         <w:spacing w:line="240" w:lineRule="auto"/>
       </w:pPr>
       <w:r>
@@ -1144,6 +1184,7 @@
     </w:p>
     <w:p>
       <w:pPr>
+        <w:keepNext/>
         <w:spacing w:line="240" w:lineRule="auto"/>
       </w:pPr>
       <w:r>
@@ -1158,6 +1199,7 @@
     </w:p>
     <w:p>
       <w:pPr>
+        <w:keepNext/>
         <w:spacing w:line="240" w:lineRule="auto"/>
       </w:pPr>
       <w:r>
@@ -1172,6 +1214,7 @@
     </w:p>
     <w:p>
       <w:pPr>
+        <w:keepNext w:val="0"/>
         <w:spacing w:line="240" w:lineRule="auto"/>
       </w:pPr>
       <w:r>
@@ -1511,12 +1554,8 @@
       </w:r>
     </w:p>
     <w:p>
-      <w:r>
-        <w:br w:type="page"/>
-      </w:r>
-    </w:p>
-    <w:p>
       <w:pPr>
+        <w:pageBreakBefore/>
         <w:spacing w:line="480" w:lineRule="auto"/>
         <w:jc w:val="center"/>
       </w:pPr>

</xml_diff>